<commit_message>
#220 - enhance tree-based scan statistic/Bernoulli to allow for a variable probability
</commit_message>
<xml_diff>
--- a/documents/VersionHistory.docx
+++ b/documents/VersionHistory.docx
@@ -540,10 +540,7 @@
         <w:t>20</w:t>
       </w:r>
       <w:r>
-        <w:t>2</w:t>
-      </w:r>
-      <w:r>
-        <w:t>4</w:t>
+        <w:t>24</w:t>
       </w:r>
       <w:r>
         <w:rPr>
@@ -556,13 +553,7 @@
         <w:rPr>
           <w:b/>
         </w:rPr>
-        <w:t>2.</w:t>
-      </w:r>
-      <w:r>
-        <w:rPr>
-          <w:b/>
-        </w:rPr>
-        <w:t>2</w:t>
+        <w:t>2.2</w:t>
       </w:r>
       <w:r>
         <w:rPr>
@@ -592,33 +583,180 @@
         <w:rPr>
           <w:bCs/>
         </w:rPr>
-        <w:t>ime range</w:t>
-      </w:r>
-      <w:r>
-        <w:rPr>
-          <w:bCs/>
-        </w:rPr>
+        <w:t>ime range.</w:t>
+      </w:r>
+    </w:p>
+    <w:p>
+      <w:pPr>
+        <w:jc w:val="both"/>
+        <w:rPr>
+          <w:bCs/>
+        </w:rPr>
+      </w:pPr>
+    </w:p>
+    <w:p>
+      <w:pPr>
+        <w:pStyle w:val="Heading5"/>
+      </w:pPr>
+      <w:r>
+        <w:t>DETAILS</w:t>
+      </w:r>
+    </w:p>
+    <w:p>
+      <w:pPr>
+        <w:ind w:left="360" w:hanging="360"/>
+        <w:jc w:val="both"/>
+        <w:rPr>
+          <w:b/>
+        </w:rPr>
+      </w:pPr>
+    </w:p>
+    <w:p>
+      <w:pPr>
+        <w:ind w:left="360" w:hanging="360"/>
+        <w:jc w:val="both"/>
+        <w:rPr>
+          <w:b/>
+        </w:rPr>
+      </w:pPr>
+      <w:r>
+        <w:rPr>
+          <w:b/>
+        </w:rPr>
+        <w:t xml:space="preserve">Version </w:t>
+      </w:r>
+      <w:r>
+        <w:rPr>
+          <w:b/>
+        </w:rPr>
+        <w:t>2.2.1</w:t>
+      </w:r>
+      <w:r>
+        <w:rPr>
+          <w:b/>
+        </w:rPr>
+        <w:t xml:space="preserve">, </w:t>
+      </w:r>
+      <w:r>
+        <w:rPr>
+          <w:b/>
+        </w:rPr>
+        <w:t>May</w:t>
+      </w:r>
+      <w:r>
+        <w:rPr>
+          <w:b/>
+        </w:rPr>
+        <w:t xml:space="preserve"> 20</w:t>
+      </w:r>
+      <w:r>
+        <w:rPr>
+          <w:b/>
+        </w:rPr>
+        <w:t>24</w:t>
+      </w:r>
+    </w:p>
+    <w:p>
+      <w:pPr>
+        <w:ind w:left="360" w:hanging="360"/>
+        <w:jc w:val="both"/>
+        <w:rPr>
+          <w:i/>
+        </w:rPr>
+      </w:pPr>
+      <w:r>
+        <w:rPr>
+          <w:i/>
+        </w:rPr>
+        <w:t>Minor Fixes</w:t>
+      </w:r>
+    </w:p>
+    <w:p>
+      <w:pPr>
+        <w:ind w:left="360" w:hanging="360"/>
+        <w:jc w:val="both"/>
+        <w:rPr>
+          <w:color w:val="212121"/>
+        </w:rPr>
+      </w:pPr>
+      <w:r>
+        <w:rPr>
+          <w:color w:val="212121"/>
+        </w:rPr>
+        <w:t>Correction to the reported number of cases excluded from analysis when applying a data time range exclusion.</w:t>
+      </w:r>
+    </w:p>
+    <w:p>
+      <w:pPr>
+        <w:ind w:left="360" w:hanging="360"/>
+        <w:jc w:val="both"/>
+        <w:rPr>
+          <w:color w:val="212121"/>
+        </w:rPr>
+      </w:pPr>
+      <w:r>
+        <w:rPr>
+          <w:color w:val="212121"/>
+        </w:rPr>
+        <w:t>Correction to the translation from input date to date index when the specified time precision is less than that of a read case or control date.</w:t>
+      </w:r>
+    </w:p>
+    <w:p>
+      <w:pPr>
+        <w:ind w:left="360" w:hanging="360"/>
+        <w:jc w:val="both"/>
+        <w:rPr>
+          <w:color w:val="212121"/>
+        </w:rPr>
+      </w:pPr>
+    </w:p>
+    <w:p>
+      <w:pPr>
+        <w:ind w:left="360" w:hanging="360"/>
+        <w:jc w:val="both"/>
+        <w:rPr>
+          <w:i/>
+        </w:rPr>
+      </w:pPr>
+      <w:r>
+        <w:rPr>
+          <w:i/>
+        </w:rPr>
+        <w:t>Other Improvements</w:t>
+      </w:r>
+    </w:p>
+    <w:p>
+      <w:pPr>
+        <w:pStyle w:val="BodyTextIndent2"/>
+        <w:jc w:val="both"/>
+      </w:pPr>
+      <w:r>
+        <w:t>Summary statistics section now reports the number of nodes evaluated when restricting which tree levels are evaluated.</w:t>
+      </w:r>
+    </w:p>
+    <w:p>
+      <w:pPr>
+        <w:pStyle w:val="BodyTextIndent2"/>
+        <w:jc w:val="both"/>
+      </w:pPr>
+      <w:r>
+        <w:t>Summary statistics section now reports the number exposed, which is a user setting used in the attributable risk calculation.</w:t>
+      </w:r>
+    </w:p>
+    <w:p>
+      <w:pPr>
+        <w:pStyle w:val="BodyTextIndent2"/>
+        <w:jc w:val="both"/>
+      </w:pPr>
+      <w:r>
+        <w:t>The link to the temporal graph is in HTML output file is now a clickable link</w:t>
+      </w:r>
+      <w:r>
         <w:t>.</w:t>
       </w:r>
     </w:p>
     <w:p>
       <w:pPr>
-        <w:jc w:val="both"/>
-        <w:rPr>
-          <w:bCs/>
-        </w:rPr>
-      </w:pPr>
-    </w:p>
-    <w:p>
-      <w:pPr>
-        <w:pStyle w:val="Heading5"/>
-      </w:pPr>
-      <w:r>
-        <w:t>DETAILS</w:t>
-      </w:r>
-    </w:p>
-    <w:p>
-      <w:pPr>
         <w:ind w:left="360" w:hanging="360"/>
         <w:jc w:val="both"/>
         <w:rPr>
@@ -644,13 +782,7 @@
         <w:rPr>
           <w:b/>
         </w:rPr>
-        <w:t>2.</w:t>
-      </w:r>
-      <w:r>
-        <w:rPr>
-          <w:b/>
-        </w:rPr>
-        <w:t>2</w:t>
+        <w:t>2.2</w:t>
       </w:r>
       <w:r>
         <w:rPr>
@@ -674,13 +806,7 @@
         <w:rPr>
           <w:b/>
         </w:rPr>
-        <w:t>2</w:t>
-      </w:r>
-      <w:r>
-        <w:rPr>
-          <w:b/>
-        </w:rPr>
-        <w:t>4</w:t>
+        <w:t>24</w:t>
       </w:r>
     </w:p>
     <w:p>
@@ -868,13 +994,7 @@
         <w:rPr>
           <w:bCs/>
         </w:rPr>
-        <w:t>Poisson</w:t>
-      </w:r>
-      <w:r>
-        <w:rPr>
-          <w:bCs/>
-        </w:rPr>
-        <w:t>.</w:t>
+        <w:t>Poisson.</w:t>
       </w:r>
     </w:p>
     <w:p>
@@ -990,6 +1110,7 @@
         <w:rPr>
           <w:rFonts w:ascii="Times New Roman" w:eastAsia="Times New Roman" w:hAnsi="Times New Roman" w:cs="Times New Roman"/>
         </w:rPr>
+        <w:lastRenderedPageBreak/>
         <w:t xml:space="preserve">Improved </w:t>
       </w:r>
       <w:r>
@@ -1205,7 +1326,6 @@
         <w:rPr>
           <w:b/>
         </w:rPr>
-        <w:lastRenderedPageBreak/>
         <w:t xml:space="preserve">Version </w:t>
       </w:r>
       <w:r>
@@ -1266,7 +1386,21 @@
         <w:rPr>
           <w:color w:val="212121"/>
         </w:rPr>
-        <w:t xml:space="preserve">Correction in the reported expected, relative risk, excess cases and attributable risk for the </w:t>
+        <w:t xml:space="preserve">Correction in the reported expected, relative risk, excess </w:t>
+      </w:r>
+      <w:proofErr w:type="gramStart"/>
+      <w:r>
+        <w:rPr>
+          <w:color w:val="212121"/>
+        </w:rPr>
+        <w:t>cases</w:t>
+      </w:r>
+      <w:proofErr w:type="gramEnd"/>
+      <w:r>
+        <w:rPr>
+          <w:color w:val="212121"/>
+        </w:rPr>
+        <w:t xml:space="preserve"> and attributable risk for the </w:t>
       </w:r>
       <w:r>
         <w:rPr>
@@ -1920,6 +2054,7 @@
         <w:rPr>
           <w:bCs/>
         </w:rPr>
+        <w:lastRenderedPageBreak/>
         <w:t>M</w:t>
       </w:r>
       <w:r>
@@ -2249,7 +2384,6 @@
         <w:rPr>
           <w:bCs/>
         </w:rPr>
-        <w:lastRenderedPageBreak/>
         <w:t>Ability to restrict the scanning to only certain pre-specified levels of the tree.</w:t>
       </w:r>
     </w:p>
@@ -3058,7 +3192,6 @@
         <w:jc w:val="both"/>
       </w:pPr>
       <w:r>
-        <w:lastRenderedPageBreak/>
         <w:t>Bernoulli model</w:t>
       </w:r>
     </w:p>
@@ -3071,8 +3204,13 @@
         <w:t>Simple, pairs, triples and ordinal cuts, defined by a c</w:t>
       </w:r>
       <w:r>
-        <w:t>ut type file</w:t>
-      </w:r>
+        <w:t xml:space="preserve">ut type </w:t>
+      </w:r>
+      <w:proofErr w:type="gramStart"/>
+      <w:r>
+        <w:t>file</w:t>
+      </w:r>
+      <w:proofErr w:type="gramEnd"/>
     </w:p>
     <w:p>
       <w:pPr>
@@ -3137,8 +3275,13 @@
         <w:t>Comma separated value (CSV)</w:t>
       </w:r>
       <w:r>
-        <w:t xml:space="preserve"> results data file</w:t>
-      </w:r>
+        <w:t xml:space="preserve"> results data </w:t>
+      </w:r>
+      <w:proofErr w:type="gramStart"/>
+      <w:r>
+        <w:t>file</w:t>
+      </w:r>
+      <w:proofErr w:type="gramEnd"/>
     </w:p>
     <w:p>
       <w:pPr>
@@ -3308,15 +3451,6 @@
   </w:num>
   <w:num w:numId="2" w16cid:durableId="1260139676">
     <w:abstractNumId w:val="1"/>
-    <w:lvlOverride w:ilvl="0"/>
-    <w:lvlOverride w:ilvl="1"/>
-    <w:lvlOverride w:ilvl="2"/>
-    <w:lvlOverride w:ilvl="3"/>
-    <w:lvlOverride w:ilvl="4"/>
-    <w:lvlOverride w:ilvl="5"/>
-    <w:lvlOverride w:ilvl="6"/>
-    <w:lvlOverride w:ilvl="7"/>
-    <w:lvlOverride w:ilvl="8"/>
   </w:num>
 </w:numbering>
 </file>
@@ -3350,6 +3484,50 @@
     <w:lsdException w:name="Strong" w:qFormat="1"/>
     <w:lsdException w:name="Emphasis" w:qFormat="1"/>
     <w:lsdException w:name="Plain Text" w:uiPriority="99"/>
+    <w:lsdException w:name="Normal Table" w:semiHidden="1" w:unhideWhenUsed="1"/>
+    <w:lsdException w:name="Table Simple 1" w:semiHidden="1" w:unhideWhenUsed="1"/>
+    <w:lsdException w:name="Table Simple 2" w:semiHidden="1" w:unhideWhenUsed="1"/>
+    <w:lsdException w:name="Table Simple 3" w:semiHidden="1" w:unhideWhenUsed="1"/>
+    <w:lsdException w:name="Table Classic 1" w:semiHidden="1" w:unhideWhenUsed="1"/>
+    <w:lsdException w:name="Table Classic 2" w:semiHidden="1" w:unhideWhenUsed="1"/>
+    <w:lsdException w:name="Table Classic 3" w:semiHidden="1" w:unhideWhenUsed="1"/>
+    <w:lsdException w:name="Table Classic 4" w:semiHidden="1" w:unhideWhenUsed="1"/>
+    <w:lsdException w:name="Table Colorful 1" w:semiHidden="1" w:unhideWhenUsed="1"/>
+    <w:lsdException w:name="Table Colorful 2" w:semiHidden="1" w:unhideWhenUsed="1"/>
+    <w:lsdException w:name="Table Colorful 3" w:semiHidden="1" w:unhideWhenUsed="1"/>
+    <w:lsdException w:name="Table Columns 1" w:semiHidden="1" w:unhideWhenUsed="1"/>
+    <w:lsdException w:name="Table Columns 2" w:semiHidden="1" w:unhideWhenUsed="1"/>
+    <w:lsdException w:name="Table Columns 3" w:semiHidden="1" w:unhideWhenUsed="1"/>
+    <w:lsdException w:name="Table Columns 4" w:semiHidden="1" w:unhideWhenUsed="1"/>
+    <w:lsdException w:name="Table Columns 5" w:semiHidden="1" w:unhideWhenUsed="1"/>
+    <w:lsdException w:name="Table Grid 1" w:semiHidden="1" w:unhideWhenUsed="1"/>
+    <w:lsdException w:name="Table Grid 2" w:semiHidden="1" w:unhideWhenUsed="1"/>
+    <w:lsdException w:name="Table Grid 3" w:semiHidden="1" w:unhideWhenUsed="1"/>
+    <w:lsdException w:name="Table Grid 4" w:semiHidden="1" w:unhideWhenUsed="1"/>
+    <w:lsdException w:name="Table Grid 5" w:semiHidden="1" w:unhideWhenUsed="1"/>
+    <w:lsdException w:name="Table Grid 6" w:semiHidden="1" w:unhideWhenUsed="1"/>
+    <w:lsdException w:name="Table Grid 7" w:semiHidden="1" w:unhideWhenUsed="1"/>
+    <w:lsdException w:name="Table Grid 8" w:semiHidden="1" w:unhideWhenUsed="1"/>
+    <w:lsdException w:name="Table List 1" w:semiHidden="1" w:unhideWhenUsed="1"/>
+    <w:lsdException w:name="Table List 2" w:semiHidden="1" w:unhideWhenUsed="1"/>
+    <w:lsdException w:name="Table List 3" w:semiHidden="1" w:unhideWhenUsed="1"/>
+    <w:lsdException w:name="Table List 4" w:semiHidden="1" w:unhideWhenUsed="1"/>
+    <w:lsdException w:name="Table List 5" w:semiHidden="1" w:unhideWhenUsed="1"/>
+    <w:lsdException w:name="Table List 6" w:semiHidden="1" w:unhideWhenUsed="1"/>
+    <w:lsdException w:name="Table List 7" w:semiHidden="1" w:unhideWhenUsed="1"/>
+    <w:lsdException w:name="Table List 8" w:semiHidden="1" w:unhideWhenUsed="1"/>
+    <w:lsdException w:name="Table 3D effects 1" w:semiHidden="1" w:unhideWhenUsed="1"/>
+    <w:lsdException w:name="Table 3D effects 2" w:semiHidden="1" w:unhideWhenUsed="1"/>
+    <w:lsdException w:name="Table 3D effects 3" w:semiHidden="1" w:unhideWhenUsed="1"/>
+    <w:lsdException w:name="Table Contemporary" w:semiHidden="1" w:unhideWhenUsed="1"/>
+    <w:lsdException w:name="Table Elegant" w:semiHidden="1" w:unhideWhenUsed="1"/>
+    <w:lsdException w:name="Table Professional" w:semiHidden="1" w:unhideWhenUsed="1"/>
+    <w:lsdException w:name="Table Subtle 1" w:semiHidden="1" w:unhideWhenUsed="1"/>
+    <w:lsdException w:name="Table Subtle 2" w:semiHidden="1" w:unhideWhenUsed="1"/>
+    <w:lsdException w:name="Table Web 1" w:semiHidden="1" w:unhideWhenUsed="1"/>
+    <w:lsdException w:name="Table Web 2" w:semiHidden="1" w:unhideWhenUsed="1"/>
+    <w:lsdException w:name="Table Web 3" w:semiHidden="1" w:unhideWhenUsed="1"/>
+    <w:lsdException w:name="Table Theme" w:semiHidden="1" w:unhideWhenUsed="1"/>
     <w:lsdException w:name="Placeholder Text" w:semiHidden="1" w:uiPriority="99"/>
     <w:lsdException w:name="No Spacing" w:uiPriority="1" w:qFormat="1"/>
     <w:lsdException w:name="Light Shading" w:uiPriority="60"/>
@@ -3655,11 +3833,15 @@
   </w:style>
   <w:style w:type="character" w:default="1" w:styleId="DefaultParagraphFont">
     <w:name w:val="Default Paragraph Font"/>
+    <w:uiPriority w:val="1"/>
     <w:semiHidden/>
+    <w:unhideWhenUsed/>
   </w:style>
   <w:style w:type="table" w:default="1" w:styleId="TableNormal">
     <w:name w:val="Normal Table"/>
+    <w:uiPriority w:val="99"/>
     <w:semiHidden/>
+    <w:unhideWhenUsed/>
     <w:tblPr>
       <w:tblInd w:w="0" w:type="dxa"/>
       <w:tblCellMar>
@@ -3672,7 +3854,9 @@
   </w:style>
   <w:style w:type="numbering" w:default="1" w:styleId="NoList">
     <w:name w:val="No List"/>
+    <w:uiPriority w:val="99"/>
     <w:semiHidden/>
+    <w:unhideWhenUsed/>
   </w:style>
   <w:style w:type="paragraph" w:styleId="BodyTextIndent">
     <w:name w:val="Body Text Indent"/>

</xml_diff>

<commit_message>
* first draft 2.4 release history
</commit_message>
<xml_diff>
--- a/documents/VersionHistory.docx
+++ b/documents/VersionHistory.docx
@@ -1,6 +1,6 @@
 
 <file path=word/document.xml><?xml version="1.0" encoding="utf-8"?>
-<w:document xmlns:wpc="http://schemas.microsoft.com/office/word/2010/wordprocessingCanvas" xmlns:cx="http://schemas.microsoft.com/office/drawing/2014/chartex" xmlns:cx1="http://schemas.microsoft.com/office/drawing/2015/9/8/chartex" xmlns:cx2="http://schemas.microsoft.com/office/drawing/2015/10/21/chartex" xmlns:cx3="http://schemas.microsoft.com/office/drawing/2016/5/9/chartex" xmlns:cx4="http://schemas.microsoft.com/office/drawing/2016/5/10/chartex" xmlns:cx5="http://schemas.microsoft.com/office/drawing/2016/5/11/chartex" xmlns:cx6="http://schemas.microsoft.com/office/drawing/2016/5/12/chartex" xmlns:cx7="http://schemas.microsoft.com/office/drawing/2016/5/13/chartex" xmlns:cx8="http://schemas.microsoft.com/office/drawing/2016/5/14/chartex" xmlns:mc="http://schemas.openxmlformats.org/markup-compatibility/2006" xmlns:aink="http://schemas.microsoft.com/office/drawing/2016/ink" xmlns:am3d="http://schemas.microsoft.com/office/drawing/2017/model3d" xmlns:o="urn:schemas-microsoft-com:office:office" xmlns:oel="http://schemas.microsoft.com/office/2019/extlst" xmlns:r="http://schemas.openxmlformats.org/officeDocument/2006/relationships" xmlns:m="http://schemas.openxmlformats.org/officeDocument/2006/math" xmlns:v="urn:schemas-microsoft-com:vml" xmlns:wp14="http://schemas.microsoft.com/office/word/2010/wordprocessingDrawing" xmlns:wp="http://schemas.openxmlformats.org/drawingml/2006/wordprocessingDrawing" xmlns:w10="urn:schemas-microsoft-com:office:word" xmlns:w="http://schemas.openxmlformats.org/wordprocessingml/2006/main" xmlns:w14="http://schemas.microsoft.com/office/word/2010/wordml" xmlns:w15="http://schemas.microsoft.com/office/word/2012/wordml" xmlns:w16cex="http://schemas.microsoft.com/office/word/2018/wordml/cex" xmlns:w16cid="http://schemas.microsoft.com/office/word/2016/wordml/cid" xmlns:w16="http://schemas.microsoft.com/office/word/2018/wordml" xmlns:w16sdtdh="http://schemas.microsoft.com/office/word/2020/wordml/sdtdatahash" xmlns:w16se="http://schemas.microsoft.com/office/word/2015/wordml/symex" xmlns:wpg="http://schemas.microsoft.com/office/word/2010/wordprocessingGroup" xmlns:wpi="http://schemas.microsoft.com/office/word/2010/wordprocessingInk" xmlns:wne="http://schemas.microsoft.com/office/word/2006/wordml" xmlns:wps="http://schemas.microsoft.com/office/word/2010/wordprocessingShape" mc:Ignorable="w14 w15 w16se w16cid w16 w16cex w16sdtdh wp14">
+<w:document xmlns:wpc="http://schemas.microsoft.com/office/word/2010/wordprocessingCanvas" xmlns:cx="http://schemas.microsoft.com/office/drawing/2014/chartex" xmlns:cx1="http://schemas.microsoft.com/office/drawing/2015/9/8/chartex" xmlns:cx2="http://schemas.microsoft.com/office/drawing/2015/10/21/chartex" xmlns:cx3="http://schemas.microsoft.com/office/drawing/2016/5/9/chartex" xmlns:cx4="http://schemas.microsoft.com/office/drawing/2016/5/10/chartex" xmlns:cx5="http://schemas.microsoft.com/office/drawing/2016/5/11/chartex" xmlns:cx6="http://schemas.microsoft.com/office/drawing/2016/5/12/chartex" xmlns:cx7="http://schemas.microsoft.com/office/drawing/2016/5/13/chartex" xmlns:cx8="http://schemas.microsoft.com/office/drawing/2016/5/14/chartex" xmlns:mc="http://schemas.openxmlformats.org/markup-compatibility/2006" xmlns:aink="http://schemas.microsoft.com/office/drawing/2016/ink" xmlns:am3d="http://schemas.microsoft.com/office/drawing/2017/model3d" xmlns:o="urn:schemas-microsoft-com:office:office" xmlns:oel="http://schemas.microsoft.com/office/2019/extlst" xmlns:r="http://schemas.openxmlformats.org/officeDocument/2006/relationships" xmlns:m="http://schemas.openxmlformats.org/officeDocument/2006/math" xmlns:v="urn:schemas-microsoft-com:vml" xmlns:wp14="http://schemas.microsoft.com/office/word/2010/wordprocessingDrawing" xmlns:wp="http://schemas.openxmlformats.org/drawingml/2006/wordprocessingDrawing" xmlns:w10="urn:schemas-microsoft-com:office:word" xmlns:w="http://schemas.openxmlformats.org/wordprocessingml/2006/main" xmlns:w14="http://schemas.microsoft.com/office/word/2010/wordml" xmlns:w15="http://schemas.microsoft.com/office/word/2012/wordml" xmlns:w16cex="http://schemas.microsoft.com/office/word/2018/wordml/cex" xmlns:w16cid="http://schemas.microsoft.com/office/word/2016/wordml/cid" xmlns:w16="http://schemas.microsoft.com/office/word/2018/wordml" xmlns:w16du="http://schemas.microsoft.com/office/word/2023/wordml/word16du" xmlns:w16sdtdh="http://schemas.microsoft.com/office/word/2020/wordml/sdtdatahash" xmlns:w16sdtfl="http://schemas.microsoft.com/office/word/2024/wordml/sdtformatlock" xmlns:w16se="http://schemas.microsoft.com/office/word/2015/wordml/symex" xmlns:wpg="http://schemas.microsoft.com/office/word/2010/wordprocessingGroup" xmlns:wpi="http://schemas.microsoft.com/office/word/2010/wordprocessingInk" xmlns:wne="http://schemas.microsoft.com/office/word/2006/wordml" xmlns:wps="http://schemas.microsoft.com/office/word/2010/wordprocessingShape" mc:Ignorable="w14 w15 w16se w16cid w16 w16cex w16sdtdh w16sdtfl w16du wp14">
   <w:body>
     <w:p>
       <w:pPr>
@@ -11,6 +11,7 @@
           <w:szCs w:val="32"/>
         </w:rPr>
       </w:pPr>
+      <w:proofErr w:type="spellStart"/>
       <w:r>
         <w:rPr>
           <w:b/>
@@ -33,7 +34,16 @@
           <w:sz w:val="32"/>
           <w:szCs w:val="32"/>
         </w:rPr>
-        <w:t>Scan Version History</w:t>
+        <w:t>Scan</w:t>
+      </w:r>
+      <w:proofErr w:type="spellEnd"/>
+      <w:r>
+        <w:rPr>
+          <w:b/>
+          <w:sz w:val="32"/>
+          <w:szCs w:val="32"/>
+        </w:rPr>
+        <w:t xml:space="preserve"> Version History</w:t>
       </w:r>
     </w:p>
     <w:p>
@@ -646,6 +656,76 @@
     </w:p>
     <w:p>
       <w:pPr>
+        <w:ind w:left="720" w:right="-180" w:hanging="720"/>
+        <w:jc w:val="both"/>
+        <w:rPr>
+          <w:bCs/>
+        </w:rPr>
+      </w:pPr>
+      <w:r>
+        <w:t>20</w:t>
+      </w:r>
+      <w:r>
+        <w:t>26</w:t>
+      </w:r>
+      <w:r>
+        <w:rPr>
+          <w:b/>
+        </w:rPr>
+        <w:tab/>
+        <w:t xml:space="preserve">Version </w:t>
+      </w:r>
+      <w:r>
+        <w:rPr>
+          <w:b/>
+        </w:rPr>
+        <w:t>2.4</w:t>
+      </w:r>
+      <w:r>
+        <w:rPr>
+          <w:b/>
+        </w:rPr>
+        <w:t>:</w:t>
+      </w:r>
+      <w:r>
+        <w:rPr>
+          <w:bCs/>
+        </w:rPr>
+        <w:t xml:space="preserve"> </w:t>
+      </w:r>
+      <w:r>
+        <w:rPr>
+          <w:bCs/>
+        </w:rPr>
+        <w:t>Trend model</w:t>
+      </w:r>
+      <w:r>
+        <w:rPr>
+          <w:bCs/>
+        </w:rPr>
+        <w:t>,</w:t>
+      </w:r>
+      <w:r>
+        <w:rPr>
+          <w:bCs/>
+        </w:rPr>
+        <w:t xml:space="preserve"> </w:t>
+      </w:r>
+      <w:r>
+        <w:rPr>
+          <w:bCs/>
+        </w:rPr>
+        <w:t>cut</w:t>
+      </w:r>
+      <w:r>
+        <w:rPr>
+          <w:bCs/>
+        </w:rPr>
+        <w:t xml:space="preserve"> window visualization.</w:t>
+      </w:r>
+    </w:p>
+    <w:p>
+      <w:pPr>
         <w:jc w:val="both"/>
         <w:rPr>
           <w:bCs/>
@@ -687,7 +767,7 @@
         <w:rPr>
           <w:b/>
         </w:rPr>
-        <w:t>2.3</w:t>
+        <w:t>2.4</w:t>
       </w:r>
       <w:r>
         <w:rPr>
@@ -711,7 +791,7 @@
         <w:rPr>
           <w:b/>
         </w:rPr>
-        <w:t>25</w:t>
+        <w:t>26</w:t>
       </w:r>
     </w:p>
     <w:p>
@@ -732,205 +812,686 @@
       <w:pPr>
         <w:pStyle w:val="BodyTextIndent2"/>
         <w:jc w:val="both"/>
-        <w:rPr>
-          <w:bCs/>
-        </w:rPr>
-      </w:pPr>
-      <w:r>
         <w:rPr>
           <w:color w:val="333333"/>
           <w:shd w:val="clear" w:color="auto" w:fill="FFFFFF"/>
         </w:rPr>
-        <w:t>Add</w:t>
-      </w:r>
+      </w:pPr>
       <w:r>
         <w:rPr>
           <w:color w:val="333333"/>
           <w:shd w:val="clear" w:color="auto" w:fill="FFFFFF"/>
         </w:rPr>
-        <w:t>ed</w:t>
-      </w:r>
-      <w:r>
+        <w:t>Introduced a trend probability model specifically designed to support genomic wastewater surveillance.</w:t>
+      </w:r>
+    </w:p>
+    <w:p>
+      <w:pPr>
+        <w:pStyle w:val="BodyTextIndent2"/>
+        <w:jc w:val="both"/>
+      </w:pPr>
+      <w:r>
+        <w:t>Added a new output file for tree-time and time-only scans that visualizes windows of reported cuts.</w:t>
+      </w:r>
+    </w:p>
+    <w:p>
+      <w:pPr>
+        <w:pStyle w:val="BodyTextIndent2"/>
+        <w:jc w:val="both"/>
+        <w:rPr>
+          <w:bCs/>
+        </w:rPr>
+      </w:pPr>
+    </w:p>
+    <w:p>
+      <w:pPr>
+        <w:ind w:left="360" w:hanging="360"/>
+        <w:jc w:val="both"/>
+        <w:rPr>
+          <w:i/>
+        </w:rPr>
+      </w:pPr>
+      <w:r>
+        <w:rPr>
+          <w:i/>
+        </w:rPr>
+        <w:t>Other Improvements</w:t>
+      </w:r>
+    </w:p>
+    <w:p>
+      <w:pPr>
+        <w:pStyle w:val="BodyTextIndent2"/>
+        <w:jc w:val="both"/>
+      </w:pPr>
+      <w:r>
+        <w:t>Updated temporal graph to allow limiting reported cuts by recurrence interval.</w:t>
+      </w:r>
+    </w:p>
+    <w:p>
+      <w:pPr>
+        <w:pStyle w:val="BodyTextIndent2"/>
+        <w:jc w:val="both"/>
+      </w:pPr>
+      <w:r>
+        <w:t>Updated temporal graph to implement global selection of series displayed in all rendered graphs.</w:t>
+      </w:r>
+    </w:p>
+    <w:p>
+      <w:pPr>
+        <w:pStyle w:val="BodyTextIndent2"/>
+        <w:jc w:val="both"/>
+      </w:pPr>
+      <w:r>
+        <w:t>Added option to specify a user specified title to be included in output files.</w:t>
+      </w:r>
+    </w:p>
+    <w:p>
+      <w:pPr>
+        <w:pStyle w:val="BodyTextIndent2"/>
+        <w:jc w:val="both"/>
+      </w:pPr>
+      <w:r>
+        <w:t>Implemented</w:t>
+      </w:r>
+      <w:r>
+        <w:t xml:space="preserve"> the </w:t>
+      </w:r>
+      <w:r>
+        <w:t>d</w:t>
+      </w:r>
+      <w:r>
+        <w:t xml:space="preserve">ata </w:t>
+      </w:r>
+      <w:r>
+        <w:t>t</w:t>
+      </w:r>
+      <w:r>
+        <w:t xml:space="preserve">ime </w:t>
+      </w:r>
+      <w:r>
+        <w:t>r</w:t>
+      </w:r>
+      <w:r>
+        <w:t xml:space="preserve">ange </w:t>
+      </w:r>
+      <w:r>
+        <w:t>e</w:t>
+      </w:r>
+      <w:r>
+        <w:t>xclusions for Bernoulli time</w:t>
+      </w:r>
+      <w:r>
+        <w:t xml:space="preserve"> and uniform time models.</w:t>
+      </w:r>
+    </w:p>
+    <w:p>
+      <w:pPr>
+        <w:pStyle w:val="BodyTextIndent2"/>
+        <w:jc w:val="both"/>
+      </w:pPr>
+      <w:r>
+        <w:t>Added file wizard feature which allows import of one-count variable, useful with the tree file.</w:t>
+      </w:r>
+    </w:p>
+    <w:p>
+      <w:pPr>
+        <w:pStyle w:val="BodyTextIndent2"/>
+        <w:jc w:val="both"/>
+      </w:pPr>
+      <w:r>
+        <w:t xml:space="preserve">Updated HTML output file to order </w:t>
+      </w:r>
+      <w:r>
+        <w:t xml:space="preserve">table </w:t>
+      </w:r>
+      <w:r>
+        <w:t>sub-nodes by relative risk, direction matching cut rate</w:t>
+      </w:r>
+      <w:r>
+        <w:t>.</w:t>
+      </w:r>
+    </w:p>
+    <w:p>
+      <w:pPr>
+        <w:pStyle w:val="BodyTextIndent2"/>
+        <w:jc w:val="both"/>
+      </w:pPr>
+      <w:r>
+        <w:t>Recurrence intervals partly reported with words when greater than one thousand years</w:t>
+      </w:r>
+      <w:r>
+        <w:t>.</w:t>
+      </w:r>
+    </w:p>
+    <w:p>
+      <w:pPr>
+        <w:pStyle w:val="BodyTextIndent2"/>
+        <w:jc w:val="both"/>
+      </w:pPr>
+      <w:r>
+        <w:t>Update</w:t>
+      </w:r>
+      <w:r>
+        <w:t>d</w:t>
+      </w:r>
+      <w:r>
+        <w:t xml:space="preserve"> graphical user </w:t>
+      </w:r>
+      <w:r>
+        <w:t>interface</w:t>
+      </w:r>
+      <w:r>
+        <w:t xml:space="preserve"> to Java 25 LTS.</w:t>
+      </w:r>
+    </w:p>
+    <w:p>
+      <w:pPr>
+        <w:pStyle w:val="BodyTextIndent2"/>
+        <w:jc w:val="both"/>
+      </w:pPr>
+      <w:r>
+        <w:t xml:space="preserve">Updated compilation to the </w:t>
+      </w:r>
+      <w:r>
+        <w:t>C++</w:t>
+      </w:r>
+      <w:r>
+        <w:t xml:space="preserve">17 </w:t>
+      </w:r>
+      <w:r>
+        <w:t>standard for the C++ programming language</w:t>
+      </w:r>
+      <w:r>
+        <w:t>.</w:t>
+      </w:r>
+    </w:p>
+    <w:p>
+      <w:pPr>
+        <w:pStyle w:val="BodyTextIndent2"/>
+        <w:jc w:val="both"/>
+        <w:rPr>
+          <w:bCs/>
+        </w:rPr>
+      </w:pPr>
+    </w:p>
+    <w:p>
+      <w:pPr>
+        <w:ind w:left="360" w:hanging="360"/>
+        <w:jc w:val="both"/>
+        <w:rPr>
+          <w:i/>
+        </w:rPr>
+      </w:pPr>
+      <w:r>
+        <w:rPr>
+          <w:i/>
+        </w:rPr>
+        <w:t>Minor Fixes</w:t>
+      </w:r>
+    </w:p>
+    <w:p>
+      <w:pPr>
+        <w:ind w:left="360" w:hanging="360"/>
+        <w:jc w:val="both"/>
+        <w:rPr>
+          <w:color w:val="212121"/>
+        </w:rPr>
+      </w:pPr>
+      <w:r>
+        <w:rPr>
+          <w:color w:val="212121"/>
+        </w:rPr>
+        <w:t xml:space="preserve">Correction </w:t>
+      </w:r>
+      <w:r>
+        <w:rPr>
+          <w:color w:val="212121"/>
+        </w:rPr>
+        <w:t>for</w:t>
+      </w:r>
+      <w:r>
+        <w:rPr>
+          <w:color w:val="212121"/>
+        </w:rPr>
+        <w:t xml:space="preserve"> reported cuts when using the early termination option</w:t>
+      </w:r>
+      <w:r>
+        <w:rPr>
+          <w:color w:val="212121"/>
+        </w:rPr>
+        <w:t>.</w:t>
+      </w:r>
+    </w:p>
+    <w:p>
+      <w:pPr>
+        <w:ind w:left="360" w:hanging="360"/>
+        <w:jc w:val="both"/>
+        <w:rPr>
+          <w:color w:val="212121"/>
+        </w:rPr>
+      </w:pPr>
+      <w:r>
+        <w:rPr>
+          <w:color w:val="212121"/>
+        </w:rPr>
+        <w:t xml:space="preserve">Updated </w:t>
+      </w:r>
+      <w:r>
+        <w:rPr>
+          <w:color w:val="212121"/>
+        </w:rPr>
+        <w:t>header row of table in HTML output</w:t>
+      </w:r>
+      <w:r>
+        <w:rPr>
+          <w:color w:val="212121"/>
+        </w:rPr>
+        <w:t xml:space="preserve"> </w:t>
+      </w:r>
+      <w:r>
+        <w:rPr>
+          <w:color w:val="212121"/>
+        </w:rPr>
+        <w:t xml:space="preserve">to </w:t>
+      </w:r>
+      <w:r>
+        <w:rPr>
+          <w:color w:val="212121"/>
+        </w:rPr>
+        <w:t>now</w:t>
+      </w:r>
+      <w:r>
+        <w:rPr>
+          <w:color w:val="212121"/>
+        </w:rPr>
+        <w:t xml:space="preserve"> horizontally scrolls with table body.</w:t>
+      </w:r>
+    </w:p>
+    <w:p>
+      <w:pPr>
+        <w:ind w:left="360" w:hanging="360"/>
+        <w:jc w:val="both"/>
+        <w:rPr>
+          <w:color w:val="212121"/>
+        </w:rPr>
+      </w:pPr>
+      <w:r>
+        <w:rPr>
+          <w:color w:val="212121"/>
+        </w:rPr>
+        <w:t xml:space="preserve">Corrected HTML </w:t>
+      </w:r>
+      <w:r>
+        <w:rPr>
+          <w:color w:val="212121"/>
+        </w:rPr>
+        <w:t xml:space="preserve">output </w:t>
+      </w:r>
+      <w:r>
+        <w:rPr>
+          <w:color w:val="212121"/>
+        </w:rPr>
+        <w:t>table</w:t>
+      </w:r>
+      <w:r>
+        <w:rPr>
+          <w:color w:val="212121"/>
+        </w:rPr>
+        <w:t xml:space="preserve"> with sub-nodes </w:t>
+      </w:r>
+      <w:r>
+        <w:rPr>
+          <w:color w:val="212121"/>
+        </w:rPr>
+        <w:t>when multiple nodes were defined in the tree file with the same name.</w:t>
+      </w:r>
+    </w:p>
+    <w:p>
+      <w:pPr>
+        <w:ind w:left="360" w:hanging="360"/>
+        <w:jc w:val="both"/>
+        <w:rPr>
+          <w:color w:val="212121"/>
+        </w:rPr>
+      </w:pPr>
+      <w:r>
+        <w:rPr>
+          <w:color w:val="212121"/>
+        </w:rPr>
+        <w:t>Correction to the temporal graph y-axis units display.</w:t>
+      </w:r>
+    </w:p>
+    <w:p>
+      <w:pPr>
+        <w:ind w:left="360" w:hanging="360"/>
+        <w:jc w:val="both"/>
         <w:rPr>
           <w:color w:val="333333"/>
           <w:shd w:val="clear" w:color="auto" w:fill="FFFFFF"/>
         </w:rPr>
-        <w:t xml:space="preserve"> a new tree-based scan statistic enhancement to the existing Bernoulli tree-based scan statistic that allows for a variable probability to be used (rather than a fixed, user-specified probability)</w:t>
-      </w:r>
-      <w:r>
-        <w:rPr>
-          <w:bCs/>
-        </w:rPr>
-        <w:t>.</w:t>
-      </w:r>
-    </w:p>
-    <w:p>
-      <w:pPr>
-        <w:pStyle w:val="BodyTextIndent2"/>
-        <w:jc w:val="both"/>
-      </w:pPr>
-      <w:r>
-        <w:t xml:space="preserve">Added an </w:t>
-      </w:r>
-      <w:r>
-        <w:t xml:space="preserve">alternative to skipping levels in tree with </w:t>
-      </w:r>
-      <w:r>
-        <w:t xml:space="preserve">the </w:t>
-      </w:r>
-      <w:r>
-        <w:t>'</w:t>
-      </w:r>
-      <w:r>
-        <w:t>Tree Levels' option</w:t>
-      </w:r>
-      <w:r>
-        <w:t>. Now specific nodes in the tree can be marked as not evaluated through exact or wildcard naming in a new input file.</w:t>
-      </w:r>
-    </w:p>
-    <w:p>
-      <w:pPr>
-        <w:pStyle w:val="BodyTextIndent2"/>
-        <w:jc w:val="both"/>
-        <w:rPr>
-          <w:bCs/>
-        </w:rPr>
-      </w:pPr>
-    </w:p>
-    <w:p>
-      <w:pPr>
-        <w:ind w:left="360" w:hanging="360"/>
-        <w:jc w:val="both"/>
-        <w:rPr>
-          <w:i/>
-        </w:rPr>
-      </w:pPr>
-      <w:r>
-        <w:rPr>
-          <w:i/>
-        </w:rPr>
-        <w:t>Other Improvements</w:t>
-      </w:r>
-    </w:p>
-    <w:p>
-      <w:pPr>
-        <w:pStyle w:val="BodyTextIndent2"/>
-        <w:jc w:val="both"/>
-      </w:pPr>
-      <w:r>
-        <w:t xml:space="preserve">For temporal graphs depicting detected clusters, it now reports the percentage of the cases in the cluster </w:t>
-      </w:r>
-      <w:r>
-        <w:t>branch</w:t>
-      </w:r>
-      <w:r>
-        <w:t xml:space="preserve"> that are also in the temporal cluster window, while comparing that percentage to outside the cluster.</w:t>
-      </w:r>
-    </w:p>
-    <w:p>
-      <w:pPr>
-        <w:pStyle w:val="BodyTextIndent2"/>
-        <w:jc w:val="both"/>
-      </w:pPr>
-      <w:r>
-        <w:t>Updated table in main results output</w:t>
-      </w:r>
-      <w:r>
-        <w:t xml:space="preserve"> in HTML format</w:t>
-      </w:r>
-      <w:r>
-        <w:t xml:space="preserve"> to include child nodes which have cases on the node but not necessarily in cluster window.</w:t>
-      </w:r>
-    </w:p>
-    <w:p>
-      <w:pPr>
-        <w:pStyle w:val="BodyTextIndent2"/>
-        <w:jc w:val="both"/>
-      </w:pPr>
-      <w:r>
-        <w:t>Created a new section in main result files to detail path to user requested additional output files.</w:t>
-      </w:r>
-    </w:p>
-    <w:p>
-      <w:pPr>
-        <w:pStyle w:val="BodyTextIndent2"/>
-        <w:jc w:val="both"/>
-      </w:pPr>
-      <w:r>
-        <w:t>Global event probability for Bernoulli tree-based scan statistic can now be entered as a decimal value.</w:t>
-      </w:r>
-    </w:p>
-    <w:p>
-      <w:pPr>
-        <w:pStyle w:val="BodyTextIndent2"/>
-        <w:jc w:val="both"/>
-        <w:rPr>
-          <w:bCs/>
-        </w:rPr>
-      </w:pPr>
-    </w:p>
-    <w:p>
-      <w:pPr>
-        <w:ind w:left="360" w:hanging="360"/>
-        <w:jc w:val="both"/>
-        <w:rPr>
-          <w:i/>
-        </w:rPr>
-      </w:pPr>
-      <w:r>
-        <w:rPr>
-          <w:i/>
-        </w:rPr>
-        <w:t>Minor Fixes</w:t>
-      </w:r>
-    </w:p>
-    <w:p>
-      <w:pPr>
-        <w:ind w:left="360" w:hanging="360"/>
-        <w:jc w:val="both"/>
-        <w:rPr>
-          <w:color w:val="212121"/>
-        </w:rPr>
-      </w:pPr>
-      <w:r>
-        <w:rPr>
-          <w:color w:val="212121"/>
-        </w:rPr>
-        <w:t xml:space="preserve">Corrected HTML/JavaScript in temporal graphical output to </w:t>
-      </w:r>
-      <w:r>
-        <w:rPr>
-          <w:color w:val="212121"/>
-        </w:rPr>
-        <w:t>correct the</w:t>
-      </w:r>
-      <w:r>
-        <w:rPr>
-          <w:color w:val="212121"/>
-        </w:rPr>
-        <w:t xml:space="preserve"> </w:t>
-      </w:r>
-      <w:r>
-        <w:rPr>
-          <w:color w:val="212121"/>
-        </w:rPr>
-        <w:t xml:space="preserve">inability to </w:t>
-      </w:r>
-      <w:r>
-        <w:rPr>
-          <w:color w:val="212121"/>
-        </w:rPr>
-        <w:t>export.</w:t>
-      </w:r>
-    </w:p>
-    <w:p>
-      <w:pPr>
-        <w:ind w:left="360" w:hanging="360"/>
-        <w:jc w:val="both"/>
+      </w:pPr>
+      <w:r>
         <w:rPr>
           <w:color w:val="333333"/>
           <w:shd w:val="clear" w:color="auto" w:fill="FFFFFF"/>
         </w:rPr>
+        <w:lastRenderedPageBreak/>
+        <w:t>Correct</w:t>
+      </w:r>
+      <w:r>
+        <w:rPr>
+          <w:color w:val="333333"/>
+          <w:shd w:val="clear" w:color="auto" w:fill="FFFFFF"/>
+        </w:rPr>
+        <w:t>ed</w:t>
+      </w:r>
+      <w:r>
+        <w:rPr>
+          <w:color w:val="333333"/>
+          <w:shd w:val="clear" w:color="auto" w:fill="FFFFFF"/>
+        </w:rPr>
+        <w:t xml:space="preserve"> reported observations in output for the v</w:t>
+      </w:r>
+      <w:r>
+        <w:rPr>
+          <w:color w:val="333333"/>
+          <w:shd w:val="clear" w:color="auto" w:fill="FFFFFF"/>
+        </w:rPr>
+        <w:t xml:space="preserve">ariable Bernoulli </w:t>
+      </w:r>
+      <w:r>
+        <w:rPr>
+          <w:color w:val="333333"/>
+          <w:shd w:val="clear" w:color="auto" w:fill="FFFFFF"/>
+        </w:rPr>
+        <w:t>without</w:t>
+      </w:r>
+      <w:r>
+        <w:rPr>
+          <w:color w:val="333333"/>
+          <w:shd w:val="clear" w:color="auto" w:fill="FFFFFF"/>
+        </w:rPr>
+        <w:t xml:space="preserve"> self-control design</w:t>
+      </w:r>
+      <w:r>
+        <w:rPr>
+          <w:color w:val="333333"/>
+          <w:shd w:val="clear" w:color="auto" w:fill="FFFFFF"/>
+        </w:rPr>
+        <w:t>.</w:t>
+      </w:r>
+    </w:p>
+    <w:p>
+      <w:pPr>
+        <w:ind w:left="360" w:hanging="360"/>
+        <w:jc w:val="both"/>
+        <w:rPr>
+          <w:b/>
+        </w:rPr>
+      </w:pPr>
+    </w:p>
+    <w:p>
+      <w:pPr>
+        <w:ind w:left="360" w:hanging="360"/>
+        <w:jc w:val="both"/>
+        <w:rPr>
+          <w:b/>
+        </w:rPr>
+      </w:pPr>
+      <w:r>
+        <w:rPr>
+          <w:b/>
+        </w:rPr>
+        <w:t xml:space="preserve">Version </w:t>
+      </w:r>
+      <w:r>
+        <w:rPr>
+          <w:b/>
+        </w:rPr>
+        <w:t>2.3</w:t>
+      </w:r>
+      <w:r>
+        <w:rPr>
+          <w:b/>
+        </w:rPr>
+        <w:t xml:space="preserve">, </w:t>
+      </w:r>
+      <w:r>
+        <w:rPr>
+          <w:b/>
+        </w:rPr>
+        <w:t>January</w:t>
+      </w:r>
+      <w:r>
+        <w:rPr>
+          <w:b/>
+        </w:rPr>
+        <w:t xml:space="preserve"> 20</w:t>
+      </w:r>
+      <w:r>
+        <w:rPr>
+          <w:b/>
+        </w:rPr>
+        <w:t>25</w:t>
+      </w:r>
+    </w:p>
+    <w:p>
+      <w:pPr>
+        <w:jc w:val="both"/>
+        <w:rPr>
+          <w:i/>
+        </w:rPr>
+      </w:pPr>
+      <w:r>
+        <w:rPr>
+          <w:i/>
+        </w:rPr>
+        <w:t>New Analytical Features</w:t>
+      </w:r>
+    </w:p>
+    <w:p>
+      <w:pPr>
+        <w:pStyle w:val="BodyTextIndent2"/>
+        <w:jc w:val="both"/>
+        <w:rPr>
+          <w:bCs/>
+        </w:rPr>
+      </w:pPr>
+      <w:r>
+        <w:rPr>
+          <w:color w:val="333333"/>
+          <w:shd w:val="clear" w:color="auto" w:fill="FFFFFF"/>
+        </w:rPr>
+        <w:t>Add</w:t>
+      </w:r>
+      <w:r>
+        <w:rPr>
+          <w:color w:val="333333"/>
+          <w:shd w:val="clear" w:color="auto" w:fill="FFFFFF"/>
+        </w:rPr>
+        <w:t>ed</w:t>
+      </w:r>
+      <w:r>
+        <w:rPr>
+          <w:color w:val="333333"/>
+          <w:shd w:val="clear" w:color="auto" w:fill="FFFFFF"/>
+        </w:rPr>
+        <w:t xml:space="preserve"> a new tree-based scan statistic enhancement to the existing Bernoulli tree-based scan statistic that allows for a variable probability to be used (rather than a fixed, user-specified probability)</w:t>
+      </w:r>
+      <w:r>
+        <w:rPr>
+          <w:bCs/>
+        </w:rPr>
+        <w:t>.</w:t>
+      </w:r>
+    </w:p>
+    <w:p>
+      <w:pPr>
+        <w:pStyle w:val="BodyTextIndent2"/>
+        <w:jc w:val="both"/>
+      </w:pPr>
+      <w:r>
+        <w:t xml:space="preserve">Added an </w:t>
+      </w:r>
+      <w:r>
+        <w:t xml:space="preserve">alternative to skipping levels in tree with </w:t>
+      </w:r>
+      <w:r>
+        <w:t xml:space="preserve">the </w:t>
+      </w:r>
+      <w:r>
+        <w:t>'</w:t>
+      </w:r>
+      <w:r>
+        <w:t>Tree Levels' option</w:t>
+      </w:r>
+      <w:r>
+        <w:t>. Now specific nodes in the tree can be marked as not evaluated through exact or wildcard naming in a new input file.</w:t>
+      </w:r>
+    </w:p>
+    <w:p>
+      <w:pPr>
+        <w:pStyle w:val="BodyTextIndent2"/>
+        <w:jc w:val="both"/>
+        <w:rPr>
+          <w:bCs/>
+        </w:rPr>
+      </w:pPr>
+    </w:p>
+    <w:p>
+      <w:pPr>
+        <w:ind w:left="360" w:hanging="360"/>
+        <w:jc w:val="both"/>
+        <w:rPr>
+          <w:i/>
+        </w:rPr>
+      </w:pPr>
+      <w:r>
+        <w:rPr>
+          <w:i/>
+        </w:rPr>
+        <w:t>Other Improvements</w:t>
+      </w:r>
+    </w:p>
+    <w:p>
+      <w:pPr>
+        <w:pStyle w:val="BodyTextIndent2"/>
+        <w:jc w:val="both"/>
+      </w:pPr>
+      <w:r>
+        <w:t xml:space="preserve">For temporal graphs depicting detected clusters, it now reports the percentage of the cases in the cluster </w:t>
+      </w:r>
+      <w:r>
+        <w:t>branch</w:t>
+      </w:r>
+      <w:r>
+        <w:t xml:space="preserve"> that are also in the temporal cluster window, while comparing that percentage to outside the cluster.</w:t>
+      </w:r>
+    </w:p>
+    <w:p>
+      <w:pPr>
+        <w:pStyle w:val="BodyTextIndent2"/>
+        <w:jc w:val="both"/>
+      </w:pPr>
+      <w:r>
+        <w:t>Updated table in main results output</w:t>
+      </w:r>
+      <w:r>
+        <w:t xml:space="preserve"> in HTML format</w:t>
+      </w:r>
+      <w:r>
+        <w:t xml:space="preserve"> to include child nodes which have cases on the node but not necessarily in cluster window.</w:t>
+      </w:r>
+    </w:p>
+    <w:p>
+      <w:pPr>
+        <w:pStyle w:val="BodyTextIndent2"/>
+        <w:jc w:val="both"/>
+      </w:pPr>
+      <w:r>
+        <w:t>Created a new section in main result files to detail path to user requested additional output files.</w:t>
+      </w:r>
+    </w:p>
+    <w:p>
+      <w:pPr>
+        <w:pStyle w:val="BodyTextIndent2"/>
+        <w:jc w:val="both"/>
+      </w:pPr>
+      <w:r>
+        <w:t>Global event probability for Bernoulli tree-based scan statistic can now be entered as a decimal value.</w:t>
+      </w:r>
+    </w:p>
+    <w:p>
+      <w:pPr>
+        <w:pStyle w:val="BodyTextIndent2"/>
+        <w:jc w:val="both"/>
+        <w:rPr>
+          <w:bCs/>
+        </w:rPr>
+      </w:pPr>
+    </w:p>
+    <w:p>
+      <w:pPr>
+        <w:ind w:left="360" w:hanging="360"/>
+        <w:jc w:val="both"/>
+        <w:rPr>
+          <w:i/>
+        </w:rPr>
+      </w:pPr>
+      <w:r>
+        <w:rPr>
+          <w:i/>
+        </w:rPr>
+        <w:t>Minor Fixes</w:t>
+      </w:r>
+    </w:p>
+    <w:p>
+      <w:pPr>
+        <w:ind w:left="360" w:hanging="360"/>
+        <w:jc w:val="both"/>
+        <w:rPr>
+          <w:color w:val="212121"/>
+        </w:rPr>
+      </w:pPr>
+      <w:r>
+        <w:rPr>
+          <w:color w:val="212121"/>
+        </w:rPr>
+        <w:t xml:space="preserve">Corrected HTML/JavaScript in temporal graphical output to </w:t>
+      </w:r>
+      <w:r>
+        <w:rPr>
+          <w:color w:val="212121"/>
+        </w:rPr>
+        <w:t>correct the</w:t>
+      </w:r>
+      <w:r>
+        <w:rPr>
+          <w:color w:val="212121"/>
+        </w:rPr>
+        <w:t xml:space="preserve"> </w:t>
+      </w:r>
+      <w:r>
+        <w:rPr>
+          <w:color w:val="212121"/>
+        </w:rPr>
+        <w:t xml:space="preserve">inability to </w:t>
+      </w:r>
+      <w:r>
+        <w:rPr>
+          <w:color w:val="212121"/>
+        </w:rPr>
+        <w:t>export.</w:t>
+      </w:r>
+    </w:p>
+    <w:p>
+      <w:pPr>
+        <w:ind w:left="360" w:hanging="360"/>
+        <w:jc w:val="both"/>
+        <w:rPr>
+          <w:color w:val="333333"/>
+          <w:shd w:val="clear" w:color="auto" w:fill="FFFFFF"/>
+        </w:rPr>
       </w:pPr>
       <w:r>
         <w:rPr>
@@ -1385,6 +1946,7 @@
         <w:jc w:val="both"/>
       </w:pPr>
       <w:r>
+        <w:lastRenderedPageBreak/>
         <w:t xml:space="preserve">Added non-analytical option </w:t>
       </w:r>
       <w:r>
@@ -2296,6 +2858,7 @@
         <w:rPr>
           <w:b/>
         </w:rPr>
+        <w:lastRenderedPageBreak/>
         <w:t>Version 1.</w:t>
       </w:r>
       <w:r>
@@ -3307,6 +3870,7 @@
         <w:rPr>
           <w:i/>
         </w:rPr>
+        <w:lastRenderedPageBreak/>
         <w:t>New Analytical Features</w:t>
       </w:r>
     </w:p>
@@ -3444,17 +4008,30 @@
         <w:pStyle w:val="BodyTextIndent2"/>
         <w:jc w:val="both"/>
       </w:pPr>
-      <w:r>
-        <w:t>TreeScan user guide in .pdf format</w:t>
-      </w:r>
-    </w:p>
-    <w:p>
-      <w:pPr>
-        <w:pStyle w:val="BodyTextIndent2"/>
-        <w:jc w:val="both"/>
-      </w:pPr>
-      <w:r>
-        <w:t>New TreeScan logo and icon</w:t>
+      <w:proofErr w:type="spellStart"/>
+      <w:r>
+        <w:t>TreeScan</w:t>
+      </w:r>
+      <w:proofErr w:type="spellEnd"/>
+      <w:r>
+        <w:t xml:space="preserve"> user guide in .pdf format</w:t>
+      </w:r>
+    </w:p>
+    <w:p>
+      <w:pPr>
+        <w:pStyle w:val="BodyTextIndent2"/>
+        <w:jc w:val="both"/>
+      </w:pPr>
+      <w:r>
+        <w:t xml:space="preserve">New </w:t>
+      </w:r>
+      <w:proofErr w:type="spellStart"/>
+      <w:r>
+        <w:t>TreeScan</w:t>
+      </w:r>
+      <w:proofErr w:type="spellEnd"/>
+      <w:r>
+        <w:t xml:space="preserve"> logo and icon</w:t>
       </w:r>
     </w:p>
     <w:p>
@@ -3636,7 +4213,7 @@
 </file>
 
 <file path=word/numbering.xml><?xml version="1.0" encoding="utf-8"?>
-<w:numbering xmlns:wpc="http://schemas.microsoft.com/office/word/2010/wordprocessingCanvas" xmlns:cx="http://schemas.microsoft.com/office/drawing/2014/chartex" xmlns:cx1="http://schemas.microsoft.com/office/drawing/2015/9/8/chartex" xmlns:cx2="http://schemas.microsoft.com/office/drawing/2015/10/21/chartex" xmlns:cx3="http://schemas.microsoft.com/office/drawing/2016/5/9/chartex" xmlns:cx4="http://schemas.microsoft.com/office/drawing/2016/5/10/chartex" xmlns:cx5="http://schemas.microsoft.com/office/drawing/2016/5/11/chartex" xmlns:cx6="http://schemas.microsoft.com/office/drawing/2016/5/12/chartex" xmlns:cx7="http://schemas.microsoft.com/office/drawing/2016/5/13/chartex" xmlns:cx8="http://schemas.microsoft.com/office/drawing/2016/5/14/chartex" xmlns:mc="http://schemas.openxmlformats.org/markup-compatibility/2006" xmlns:aink="http://schemas.microsoft.com/office/drawing/2016/ink" xmlns:am3d="http://schemas.microsoft.com/office/drawing/2017/model3d" xmlns:o="urn:schemas-microsoft-com:office:office" xmlns:oel="http://schemas.microsoft.com/office/2019/extlst" xmlns:r="http://schemas.openxmlformats.org/officeDocument/2006/relationships" xmlns:m="http://schemas.openxmlformats.org/officeDocument/2006/math" xmlns:v="urn:schemas-microsoft-com:vml" xmlns:wp14="http://schemas.microsoft.com/office/word/2010/wordprocessingDrawing" xmlns:wp="http://schemas.openxmlformats.org/drawingml/2006/wordprocessingDrawing" xmlns:w10="urn:schemas-microsoft-com:office:word" xmlns:w="http://schemas.openxmlformats.org/wordprocessingml/2006/main" xmlns:w14="http://schemas.microsoft.com/office/word/2010/wordml" xmlns:w15="http://schemas.microsoft.com/office/word/2012/wordml" xmlns:w16cex="http://schemas.microsoft.com/office/word/2018/wordml/cex" xmlns:w16cid="http://schemas.microsoft.com/office/word/2016/wordml/cid" xmlns:w16="http://schemas.microsoft.com/office/word/2018/wordml" xmlns:w16sdtdh="http://schemas.microsoft.com/office/word/2020/wordml/sdtdatahash" xmlns:w16se="http://schemas.microsoft.com/office/word/2015/wordml/symex" xmlns:wpg="http://schemas.microsoft.com/office/word/2010/wordprocessingGroup" xmlns:wpi="http://schemas.microsoft.com/office/word/2010/wordprocessingInk" xmlns:wne="http://schemas.microsoft.com/office/word/2006/wordml" xmlns:wps="http://schemas.microsoft.com/office/word/2010/wordprocessingShape" mc:Ignorable="w14 w15 w16se w16cid w16 w16cex w16sdtdh wp14">
+<w:numbering xmlns:wpc="http://schemas.microsoft.com/office/word/2010/wordprocessingCanvas" xmlns:cx="http://schemas.microsoft.com/office/drawing/2014/chartex" xmlns:cx1="http://schemas.microsoft.com/office/drawing/2015/9/8/chartex" xmlns:cx2="http://schemas.microsoft.com/office/drawing/2015/10/21/chartex" xmlns:cx3="http://schemas.microsoft.com/office/drawing/2016/5/9/chartex" xmlns:cx4="http://schemas.microsoft.com/office/drawing/2016/5/10/chartex" xmlns:cx5="http://schemas.microsoft.com/office/drawing/2016/5/11/chartex" xmlns:cx6="http://schemas.microsoft.com/office/drawing/2016/5/12/chartex" xmlns:cx7="http://schemas.microsoft.com/office/drawing/2016/5/13/chartex" xmlns:cx8="http://schemas.microsoft.com/office/drawing/2016/5/14/chartex" xmlns:mc="http://schemas.openxmlformats.org/markup-compatibility/2006" xmlns:aink="http://schemas.microsoft.com/office/drawing/2016/ink" xmlns:am3d="http://schemas.microsoft.com/office/drawing/2017/model3d" xmlns:o="urn:schemas-microsoft-com:office:office" xmlns:oel="http://schemas.microsoft.com/office/2019/extlst" xmlns:r="http://schemas.openxmlformats.org/officeDocument/2006/relationships" xmlns:m="http://schemas.openxmlformats.org/officeDocument/2006/math" xmlns:v="urn:schemas-microsoft-com:vml" xmlns:wp14="http://schemas.microsoft.com/office/word/2010/wordprocessingDrawing" xmlns:wp="http://schemas.openxmlformats.org/drawingml/2006/wordprocessingDrawing" xmlns:w10="urn:schemas-microsoft-com:office:word" xmlns:w="http://schemas.openxmlformats.org/wordprocessingml/2006/main" xmlns:w14="http://schemas.microsoft.com/office/word/2010/wordml" xmlns:w15="http://schemas.microsoft.com/office/word/2012/wordml" xmlns:w16cex="http://schemas.microsoft.com/office/word/2018/wordml/cex" xmlns:w16cid="http://schemas.microsoft.com/office/word/2016/wordml/cid" xmlns:w16="http://schemas.microsoft.com/office/word/2018/wordml" xmlns:w16du="http://schemas.microsoft.com/office/word/2023/wordml/word16du" xmlns:w16sdtdh="http://schemas.microsoft.com/office/word/2020/wordml/sdtdatahash" xmlns:w16sdtfl="http://schemas.microsoft.com/office/word/2024/wordml/sdtformatlock" xmlns:w16se="http://schemas.microsoft.com/office/word/2015/wordml/symex" xmlns:wpg="http://schemas.microsoft.com/office/word/2010/wordprocessingGroup" xmlns:wpi="http://schemas.microsoft.com/office/word/2010/wordprocessingInk" xmlns:wne="http://schemas.microsoft.com/office/word/2006/wordml" xmlns:wps="http://schemas.microsoft.com/office/word/2010/wordprocessingShape" mc:Ignorable="w14 w15 w16se w16cid w16 w16cex w16sdtdh w16sdtfl w16du wp14">
   <w:abstractNum w:abstractNumId="0" w15:restartNumberingAfterBreak="0">
     <w:nsid w:val="FFFFFF89"/>
     <w:multiLevelType w:val="singleLevel"/>
@@ -3779,7 +4356,7 @@
 </file>
 
 <file path=word/styles.xml><?xml version="1.0" encoding="utf-8"?>
-<w:styles xmlns:mc="http://schemas.openxmlformats.org/markup-compatibility/2006" xmlns:r="http://schemas.openxmlformats.org/officeDocument/2006/relationships" xmlns:w="http://schemas.openxmlformats.org/wordprocessingml/2006/main" xmlns:w14="http://schemas.microsoft.com/office/word/2010/wordml" xmlns:w15="http://schemas.microsoft.com/office/word/2012/wordml" xmlns:w16cex="http://schemas.microsoft.com/office/word/2018/wordml/cex" xmlns:w16cid="http://schemas.microsoft.com/office/word/2016/wordml/cid" xmlns:w16="http://schemas.microsoft.com/office/word/2018/wordml" xmlns:w16sdtdh="http://schemas.microsoft.com/office/word/2020/wordml/sdtdatahash" xmlns:w16se="http://schemas.microsoft.com/office/word/2015/wordml/symex" mc:Ignorable="w14 w15 w16se w16cid w16 w16cex w16sdtdh">
+<w:styles xmlns:mc="http://schemas.openxmlformats.org/markup-compatibility/2006" xmlns:r="http://schemas.openxmlformats.org/officeDocument/2006/relationships" xmlns:w="http://schemas.openxmlformats.org/wordprocessingml/2006/main" xmlns:w14="http://schemas.microsoft.com/office/word/2010/wordml" xmlns:w15="http://schemas.microsoft.com/office/word/2012/wordml" xmlns:w16cex="http://schemas.microsoft.com/office/word/2018/wordml/cex" xmlns:w16cid="http://schemas.microsoft.com/office/word/2016/wordml/cid" xmlns:w16="http://schemas.microsoft.com/office/word/2018/wordml" xmlns:w16du="http://schemas.microsoft.com/office/word/2023/wordml/word16du" xmlns:w16sdtdh="http://schemas.microsoft.com/office/word/2020/wordml/sdtdatahash" xmlns:w16sdtfl="http://schemas.microsoft.com/office/word/2024/wordml/sdtformatlock" xmlns:w16se="http://schemas.microsoft.com/office/word/2015/wordml/symex" mc:Ignorable="w14 w15 w16se w16cid w16 w16cex w16sdtdh w16sdtfl w16du">
   <w:docDefaults>
     <w:rPrDefault>
       <w:rPr>

</xml_diff>

<commit_message>
* 2.4 release updates
</commit_message>
<xml_diff>
--- a/documents/VersionHistory.docx
+++ b/documents/VersionHistory.docx
@@ -779,7 +779,7 @@
         <w:rPr>
           <w:b/>
         </w:rPr>
-        <w:t>January</w:t>
+        <w:t>April</w:t>
       </w:r>
       <w:r>
         <w:rPr>
@@ -831,7 +831,13 @@
         <w:jc w:val="both"/>
       </w:pPr>
       <w:r>
-        <w:t>Added a new output file for tree-time and time-only scans that visualizes windows of reported cuts.</w:t>
+        <w:t xml:space="preserve">Added a new output file for tree-time and time-only scans that </w:t>
+      </w:r>
+      <w:r>
+        <w:t>visualize</w:t>
+      </w:r>
+      <w:r>
+        <w:t xml:space="preserve"> windows of reported cuts.</w:t>
       </w:r>
     </w:p>
     <w:p>
@@ -1158,7 +1164,7 @@
         <w:rPr>
           <w:color w:val="212121"/>
         </w:rPr>
-        <w:t>Correction to the temporal graph y-axis units display.</w:t>
+        <w:t>Correction to the temporal graph y-axis unit display.</w:t>
       </w:r>
     </w:p>
     <w:p>

</xml_diff>